<commit_message>
Remove off-center Trailblazer from finals; 92/100 ready, 8 pending; regen manifest
</commit_message>
<xml_diff>
--- a/docs/badge-manifest.docx
+++ b/docs/badge-manifest.docx
@@ -14002,13 +14002,13 @@
             </w:pPr>
             <w:r>
               <w:rPr>
-                <w:b w:val="false"/>
-                <w:bCs w:val="false"/>
-                <w:color w:val="2E7D32"/>
-                <w:sz w:val="14"/>
-                <w:szCs w:val="14"/>
-              </w:rPr>
-              <w:t xml:space="preserve">Yes</w:t>
+                <w:b/>
+                <w:bCs/>
+                <w:color w:val="B00020"/>
+                <w:sz w:val="14"/>
+                <w:szCs w:val="14"/>
+              </w:rPr>
+              <w:t xml:space="preserve">TO DO</w:t>
             </w:r>
           </w:p>
         </w:tc>

</xml_diff>